<commit_message>
Resume: add portfolio link; Liverpool entry reads 'studies interrupted'
Co-Authored-By: Claude Opus 5.5 <noreply@anthropic.com>
Claude-Session: https://claude.ai/code/session_01HaAqdXqxTuinBnmdidnP78
</commit_message>
<xml_diff>
--- a/public/resume/Yashashwin-Doranala-Resume.docx
+++ b/public/resume/Yashashwin-Doranala-Resume.docx
@@ -34,6 +34,32 @@
     </w:p>
     <w:p>
       <w:pPr>
+        <w:spacing w:after="20"/>
+        <w:jc w:val="center"/>
+      </w:pPr>
+      <w:r>
+        <w:rPr>
+          <w:rFonts w:ascii="Calibri" w:cs="Calibri" w:eastAsia="Calibri" w:hAnsi="Calibri"/>
+          <w:sz w:val="20"/>
+          <w:szCs w:val="20"/>
+        </w:rPr>
+        <w:t xml:space="preserve">Portfolio: </w:t>
+      </w:r>
+      <w:hyperlink r:id="rIdPortfolio" w:history="1">
+        <w:r>
+          <w:rPr>
+            <w:rFonts w:ascii="Calibri" w:cs="Calibri" w:eastAsia="Calibri" w:hAnsi="Calibri"/>
+            <w:color w:val="0563C1"/>
+            <w:sz w:val="20"/>
+            <w:szCs w:val="20"/>
+            <w:u w:val="single"/>
+          </w:rPr>
+          <w:t>yashashwin-portfolio.vercel.app</w:t>
+        </w:r>
+      </w:hyperlink>
+    </w:p>
+    <w:p>
+      <w:pPr>
         <w:spacing w:after="60"/>
         <w:jc w:val="center"/>
       </w:pPr>
@@ -131,19 +157,7 @@
           <w:sz w:val="20"/>
           <w:szCs w:val="20"/>
         </w:rPr>
-        <w:t xml:space="preserve">GPI India — Associate Engineer II</w:t>
-      </w:r>
-      <w:r>
-        <w:rPr>
-          <w:rFonts w:ascii="Calibri" w:cs="Calibri" w:eastAsia="Calibri" w:hAnsi="Calibri"/>
-          <w:b/>
-          <w:bCs/>
-          <w:i w:val="false"/>
-          <w:iCs w:val="false"/>
-          <w:sz w:val="20"/>
-          <w:szCs w:val="20"/>
-        </w:rPr>
-        <w:t xml:space="preserve">	Jun 2026 – Present</w:t>
+        <w:t xml:space="preserve">GPI India — Associate Engineer II	Jun 2026 – Present</w:t>
       </w:r>
     </w:p>
     <w:p>
@@ -399,19 +413,7 @@
           <w:sz w:val="20"/>
           <w:szCs w:val="20"/>
         </w:rPr>
-        <w:t xml:space="preserve">SAMSI Techno — Software Engineer</w:t>
-      </w:r>
-      <w:r>
-        <w:rPr>
-          <w:rFonts w:ascii="Calibri" w:cs="Calibri" w:eastAsia="Calibri" w:hAnsi="Calibri"/>
-          <w:b/>
-          <w:bCs/>
-          <w:i w:val="false"/>
-          <w:iCs w:val="false"/>
-          <w:sz w:val="20"/>
-          <w:szCs w:val="20"/>
-        </w:rPr>
-        <w:t xml:space="preserve">	Jan 2026 – Jun 2026</w:t>
+        <w:t xml:space="preserve">SAMSI Techno — Software Engineer	Jan 2026 – Jun 2026</w:t>
       </w:r>
     </w:p>
     <w:p>
@@ -517,19 +519,7 @@
           <w:sz w:val="20"/>
           <w:szCs w:val="20"/>
         </w:rPr>
-        <w:t xml:space="preserve">Coaxial Photo-Surveying Drone — Design, Manufacture and Test (Univ. of Liverpool)</w:t>
-      </w:r>
-      <w:r>
-        <w:rPr>
-          <w:rFonts w:ascii="Calibri" w:cs="Calibri" w:eastAsia="Calibri" w:hAnsi="Calibri"/>
-          <w:b/>
-          <w:bCs/>
-          <w:i w:val="false"/>
-          <w:iCs w:val="false"/>
-          <w:sz w:val="20"/>
-          <w:szCs w:val="20"/>
-        </w:rPr>
-        <w:t xml:space="preserve">	Sep 2024 – Apr 2025</w:t>
+        <w:t xml:space="preserve">Coaxial Photo-Surveying Drone — Design, Manufacture and Test (Univ. of Liverpool)	Sep 2024 – Apr 2025</w:t>
       </w:r>
     </w:p>
     <w:p>
@@ -639,19 +629,7 @@
           <w:sz w:val="20"/>
           <w:szCs w:val="20"/>
         </w:rPr>
-        <w:t xml:space="preserve">FEA and Vibration Study of Aircraft Landing Gear</w:t>
-      </w:r>
-      <w:r>
-        <w:rPr>
-          <w:rFonts w:ascii="Calibri" w:cs="Calibri" w:eastAsia="Calibri" w:hAnsi="Calibri"/>
-          <w:b/>
-          <w:bCs/>
-          <w:i w:val="false"/>
-          <w:iCs w:val="false"/>
-          <w:sz w:val="20"/>
-          <w:szCs w:val="20"/>
-        </w:rPr>
-        <w:t xml:space="preserve">	Sep 2024 – Nov 2024</w:t>
+        <w:t xml:space="preserve">FEA and Vibration Study of Aircraft Landing Gear	Sep 2024 – Nov 2024</w:t>
       </w:r>
     </w:p>
     <w:p>
@@ -725,19 +703,7 @@
           <w:sz w:val="20"/>
           <w:szCs w:val="20"/>
         </w:rPr>
-        <w:t xml:space="preserve">3D CFD Study of Concentrated Solar-Thermal Collectors (B.Tech thesis)</w:t>
-      </w:r>
-      <w:r>
-        <w:rPr>
-          <w:rFonts w:ascii="Calibri" w:cs="Calibri" w:eastAsia="Calibri" w:hAnsi="Calibri"/>
-          <w:b/>
-          <w:bCs/>
-          <w:i w:val="false"/>
-          <w:iCs w:val="false"/>
-          <w:sz w:val="20"/>
-          <w:szCs w:val="20"/>
-        </w:rPr>
-        <w:t xml:space="preserve">	Jan 2024 – Jun 2024</w:t>
+        <w:t xml:space="preserve">3D CFD Study of Concentrated Solar-Thermal Collectors (B.Tech thesis)	Jan 2024 – Jun 2024</w:t>
       </w:r>
     </w:p>
     <w:p>
@@ -841,7 +807,7 @@
         <w:rPr>
           <w:b/>
         </w:rPr>
-        <w:t>University of Liverpool, UK — MSc Aerospace Engineering coursework (not completed)</w:t>
+        <w:t>University of Liverpool, UK — MSc Aerospace Engineering coursework (studies interrupted)</w:t>
       </w:r>
       <w:r>
         <w:tab/>

</xml_diff>

<commit_message>
Resume: Education and Skills sections in Calibri to match the rest
Co-Authored-By: Claude Opus 5.5 <noreply@anthropic.com>
Claude-Session: https://claude.ai/code/session_01HaAqdXqxTuinBnmdidnP78
</commit_message>
<xml_diff>
--- a/public/resume/Yashashwin-Doranala-Resume.docx
+++ b/public/resume/Yashashwin-Doranala-Resume.docx
@@ -781,17 +781,28 @@
     <w:p>
       <w:pPr>
         <w:tabs>
-          <w:tab w:pos="9360" w:val="right"/>
+          <w:tab w:val="right" w:pos="10466"/>
         </w:tabs>
         <w:spacing w:after="20" w:before="80"/>
       </w:pPr>
       <w:r>
         <w:rPr>
-          <w:b/>
+          <w:rFonts w:ascii="Calibri" w:cs="Calibri" w:eastAsia="Calibri" w:hAnsi="Calibri"/>
+          <w:b/>
+          <w:bCs/>
+          <w:sz w:val="20"/>
+          <w:szCs w:val="20"/>
         </w:rPr>
         <w:t>Manipal Institute of Technology — B.Tech, Mechanical Engineering</w:t>
       </w:r>
       <w:r>
+        <w:rPr>
+          <w:rFonts w:ascii="Calibri" w:cs="Calibri" w:eastAsia="Calibri" w:hAnsi="Calibri"/>
+          <w:b/>
+          <w:bCs/>
+          <w:sz w:val="20"/>
+          <w:szCs w:val="20"/>
+        </w:rPr>
         <w:tab/>
         <w:t>2020 – 2024</w:t>
       </w:r>
@@ -799,17 +810,28 @@
     <w:p>
       <w:pPr>
         <w:tabs>
-          <w:tab w:pos="9360" w:val="right"/>
+          <w:tab w:val="right" w:pos="10466"/>
         </w:tabs>
         <w:spacing w:after="20" w:before="80"/>
       </w:pPr>
       <w:r>
         <w:rPr>
-          <w:b/>
+          <w:rFonts w:ascii="Calibri" w:cs="Calibri" w:eastAsia="Calibri" w:hAnsi="Calibri"/>
+          <w:b/>
+          <w:bCs/>
+          <w:sz w:val="20"/>
+          <w:szCs w:val="20"/>
         </w:rPr>
         <w:t>University of Liverpool, UK — MSc Aerospace Engineering coursework (studies interrupted)</w:t>
       </w:r>
       <w:r>
+        <w:rPr>
+          <w:rFonts w:ascii="Calibri" w:cs="Calibri" w:eastAsia="Calibri" w:hAnsi="Calibri"/>
+          <w:b/>
+          <w:bCs/>
+          <w:sz w:val="20"/>
+          <w:szCs w:val="20"/>
+        </w:rPr>
         <w:tab/>
         <w:t>2024 – 2025</w:t>
       </w:r>
@@ -817,16 +839,28 @@
     <w:p>
       <w:pPr>
         <w:tabs>
-          <w:tab w:pos="9360" w:val="right"/>
+          <w:tab w:val="right" w:pos="10466"/>
         </w:tabs>
-      </w:pPr>
-      <w:r>
-        <w:rPr>
-          <w:b/>
+        <w:spacing w:after="20" w:before="80"/>
+      </w:pPr>
+      <w:r>
+        <w:rPr>
+          <w:rFonts w:ascii="Calibri" w:cs="Calibri" w:eastAsia="Calibri" w:hAnsi="Calibri"/>
+          <w:b/>
+          <w:bCs/>
+          <w:sz w:val="20"/>
+          <w:szCs w:val="20"/>
         </w:rPr>
         <w:t>Torrey Pines High School</w:t>
       </w:r>
       <w:r>
+        <w:rPr>
+          <w:rFonts w:ascii="Calibri" w:cs="Calibri" w:eastAsia="Calibri" w:hAnsi="Calibri"/>
+          <w:b/>
+          <w:bCs/>
+          <w:sz w:val="20"/>
+          <w:szCs w:val="20"/>
+        </w:rPr>
         <w:tab/>
         <w:t>2020 – 2024</w:t>
       </w:r>
@@ -861,36 +895,38 @@
           <w:sz w:val="20"/>
           <w:szCs w:val="20"/>
         </w:rPr>
-        <w:t>CAD: Solid Edge, ProgeCAD, SolidWorks, Creo, CATIA V5, Autodesk Fusion; engineering file and BOM handling in Ridder iQ ERP</w:t>
-      </w:r>
-      <w:r>
-        <w:rPr>
-          <w:rFonts w:ascii="Calibri" w:cs="Calibri" w:eastAsia="Calibri" w:hAnsi="Calibri"/>
-          <w:sz w:val="20"/>
-          <w:szCs w:val="20"/>
-        </w:rPr>
-      </w:r>
-    </w:p>
-    <w:p>
-      <w:pPr>
-        <w:spacing w:after="20"/>
-      </w:pPr>
-      <w:r>
-        <w:rPr>
-          <w:rFonts w:ascii="Calibri" w:cs="Calibri" w:eastAsia="Calibri" w:hAnsi="Calibri"/>
-          <w:b/>
-          <w:bCs/>
-          <w:sz w:val="20"/>
-          <w:szCs w:val="20"/>
-        </w:rPr>
-        <w:t>Design: 3D modelling, 2D manufacturing drawings, sections and detail views, EN ISO 13920, sheet metal, special-part drawings, DXF and bend drawings, BOM management, assembly documentation, EN ISO 14122</w:t>
-      </w:r>
-      <w:r>
-        <w:rPr>
-          <w:rFonts w:ascii="Calibri" w:cs="Calibri" w:eastAsia="Calibri" w:hAnsi="Calibri"/>
-          <w:sz w:val="20"/>
-          <w:szCs w:val="20"/>
-        </w:rPr>
+        <w:t xml:space="preserve">CAD: </w:t>
+      </w:r>
+      <w:r>
+        <w:rPr>
+          <w:rFonts w:ascii="Calibri" w:cs="Calibri" w:eastAsia="Calibri" w:hAnsi="Calibri"/>
+          <w:sz w:val="20"/>
+          <w:szCs w:val="20"/>
+        </w:rPr>
+        <w:t>Solid Edge, ProgeCAD, SolidWorks, Creo, CATIA V5, Autodesk Fusion; engineering file and BOM handling in Ridder iQ ERP</w:t>
+      </w:r>
+    </w:p>
+    <w:p>
+      <w:pPr>
+        <w:spacing w:after="20"/>
+      </w:pPr>
+      <w:r>
+        <w:rPr>
+          <w:rFonts w:ascii="Calibri" w:cs="Calibri" w:eastAsia="Calibri" w:hAnsi="Calibri"/>
+          <w:b/>
+          <w:bCs/>
+          <w:sz w:val="20"/>
+          <w:szCs w:val="20"/>
+        </w:rPr>
+        <w:t xml:space="preserve">Design: </w:t>
+      </w:r>
+      <w:r>
+        <w:rPr>
+          <w:rFonts w:ascii="Calibri" w:cs="Calibri" w:eastAsia="Calibri" w:hAnsi="Calibri"/>
+          <w:sz w:val="20"/>
+          <w:szCs w:val="20"/>
+        </w:rPr>
+        <w:t>3D modelling, 2D manufacturing drawings, sections and detail views, EN ISO 13920, sheet metal, special-part drawings, DXF and bend drawings, BOM management, assembly documentation, EN ISO 14122</w:t>
       </w:r>
     </w:p>
     <w:p>

</xml_diff>

<commit_message>
Resume: one page; portfolio link on the contact line; remove high school and availability line
Co-Authored-By: Claude Opus 5.5 <noreply@anthropic.com>
Claude-Session: https://claude.ai/code/session_01HaAqdXqxTuinBnmdidnP78
</commit_message>
<xml_diff>
--- a/public/resume/Yashashwin-Doranala-Resume.docx
+++ b/public/resume/Yashashwin-Doranala-Resume.docx
@@ -20,7 +20,7 @@
     </w:p>
     <w:p>
       <w:pPr>
-        <w:spacing w:after="20"/>
+        <w:spacing w:after="60"/>
         <w:jc w:val="center"/>
       </w:pPr>
       <w:r>
@@ -29,21 +29,7 @@
           <w:sz w:val="20"/>
           <w:szCs w:val="20"/>
         </w:rPr>
-        <w:t xml:space="preserve">+91-7993767444  |  Yashdoranala@gmail.com  |  linkedin.com/in/yashashwin-doranala</w:t>
-      </w:r>
-    </w:p>
-    <w:p>
-      <w:pPr>
-        <w:spacing w:after="20"/>
-        <w:jc w:val="center"/>
-      </w:pPr>
-      <w:r>
-        <w:rPr>
-          <w:rFonts w:ascii="Calibri" w:cs="Calibri" w:eastAsia="Calibri" w:hAnsi="Calibri"/>
-          <w:sz w:val="20"/>
-          <w:szCs w:val="20"/>
-        </w:rPr>
-        <w:t xml:space="preserve">Portfolio: </w:t>
+        <w:t xml:space="preserve">+91-7993767444  |  Yashdoranala@gmail.com  |  linkedin.com/in/yashashwin-doranala  |  </w:t>
       </w:r>
       <w:hyperlink r:id="rIdPortfolio" w:history="1">
         <w:r>
@@ -60,22 +46,6 @@
     </w:p>
     <w:p>
       <w:pPr>
-        <w:spacing w:after="60"/>
-        <w:jc w:val="center"/>
-      </w:pPr>
-      <w:r>
-        <w:rPr>
-          <w:rFonts w:ascii="Calibri" w:cs="Calibri" w:eastAsia="Calibri" w:hAnsi="Calibri"/>
-          <w:b/>
-          <w:bCs/>
-          <w:sz w:val="20"/>
-          <w:szCs w:val="20"/>
-        </w:rPr>
-        <w:t xml:space="preserve">Available to join immediately</w:t>
-      </w:r>
-    </w:p>
-    <w:p>
-      <w:pPr>
         <w:pBdr>
           <w:bottom w:val="single" w:color="000000" w:sz="6" w:space="1"/>
         </w:pBdr>
@@ -834,35 +804,6 @@
         </w:rPr>
         <w:tab/>
         <w:t>2024 – 2025</w:t>
-      </w:r>
-    </w:p>
-    <w:p>
-      <w:pPr>
-        <w:tabs>
-          <w:tab w:val="right" w:pos="10466"/>
-        </w:tabs>
-        <w:spacing w:after="20" w:before="80"/>
-      </w:pPr>
-      <w:r>
-        <w:rPr>
-          <w:rFonts w:ascii="Calibri" w:cs="Calibri" w:eastAsia="Calibri" w:hAnsi="Calibri"/>
-          <w:b/>
-          <w:bCs/>
-          <w:sz w:val="20"/>
-          <w:szCs w:val="20"/>
-        </w:rPr>
-        <w:t>Torrey Pines High School</w:t>
-      </w:r>
-      <w:r>
-        <w:rPr>
-          <w:rFonts w:ascii="Calibri" w:cs="Calibri" w:eastAsia="Calibri" w:hAnsi="Calibri"/>
-          <w:b/>
-          <w:bCs/>
-          <w:sz w:val="20"/>
-          <w:szCs w:val="20"/>
-        </w:rPr>
-        <w:tab/>
-        <w:t>2020 – 2024</w:t>
       </w:r>
     </w:p>
     <w:p>

</xml_diff>